<commit_message>
Sync docs with the approved pre-build review fixes
Updates the protocol spec, Phase 1 build plan, decision log, README,
SECURITY, the Word plan and the architecture plan export (doc rev 128)
from the corrected sources. Moves the research docs from docs/research/
into docs/ to match the mapping now stated in build plan task 1, so the
starter files' docs/security-review.md links resolve as written.

Co-Authored-By: Claude Opus 5.5 (1M context) <noreply@anthropic.com>
Claude-Session: https://claude.ai/code/session_0164AnSSjTpg7eVTuxvNRwb9
</commit_message>
<xml_diff>
--- a/docs/LLM-Bridge-Architecture-Plan.docx
+++ b/docs/LLM-Bridge-Architecture-Plan.docx
@@ -75,7 +75,7 @@
         <w:rPr>
           <w:b/>
         </w:rPr>
-        <w:t xml:space="preserve">Start with what exists:</w:t>
+        <w:t xml:space="preserve">Two-way from the start:</w:t>
       </w:r>
       <w:r>
         <w:t xml:space="preserve"> OpenAI's official </w:t>
@@ -87,7 +87,7 @@
         <w:t xml:space="preserve">codex-plugin-cc</w:t>
       </w:r>
       <w:r>
-        <w:t xml:space="preserve"> already lets Claude Code hand work to Codex. Security-review it (est. 3 to 6 h), use it for a couple of weeks, and build only if you miss Codex starting work on Claude.</w:t>
+        <w:t xml:space="preserve"> lets Claude Code hand work to Codex, but only in that direction. You want both directions, so there is no trial phase. The build starts with Phase 1, and the plugin is at most a later Claude-to-Codex shortcut.</w:t>
       </w:r>
     </w:p>
     <w:p>
@@ -123,7 +123,7 @@
         <w:t xml:space="preserve">Cost:</w:t>
       </w:r>
       <w:r>
-        <w:t xml:space="preserve"> est. 15 to 25 h for a working prototype, another 20 to 40 h before it can be trusted unattended, then 2 to 4 h a month of upkeep as preview APIs change. An independent security review adds an estimated 4 to 8 h of must-fix items to Phase 1 and rates outside attack risk low while the hub stays on your machine.</w:t>
+        <w:t xml:space="preserve"> est. 40 to 70 h for Phase 1, including the security review's must-fix items, then 15 to 25 h to add routing and 10 to 20 h for Phase 2 (the pre-build review's ranges). Another 20 to 40 h takes it to daily-driver quality, then 2 to 4 h a month of upkeep as preview APIs change. The security review rates outside attack risk low while the hub stays on your machine.</w:t>
       </w:r>
     </w:p>
     <w:p>
@@ -238,7 +238,7 @@
         <w:t xml:space="preserve">Claude liaison.</w:t>
       </w:r>
       <w:r>
-        <w:t xml:space="preserve"> A normal Claude Code session that you start in a terminal and can type into. The hub feeds it messages through a custom channel, a Claude Code feature that pushes events into a running session (</w:t>
+        <w:t xml:space="preserve"> A normal Claude Code session you can type into. The hub generates its command line, settings file and config folder. You start it in your terminal, or attach to a terminal the hub owns, and confirm the development-channel flag each time it starts. The hub feeds it messages through a custom channel, a Claude Code feature that pushes events into a running session (</w:t>
       </w:r>
       <w:hyperlink r:id="rId5" w:history="1">
         <w:r>
@@ -289,7 +289,7 @@
         <w:t xml:space="preserve">Codex liaison.</w:t>
       </w:r>
       <w:r>
-        <w:t xml:space="preserve"> One long-lived Codex thread. Phase 1 drives it through the </w:t>
+        <w:t xml:space="preserve"> One long-lived Codex thread. Phase 1 drives it through the TypeScript </w:t>
       </w:r>
       <w:hyperlink r:id="rId8" w:history="1">
         <w:r>
@@ -300,7 +300,7 @@
         </w:r>
       </w:hyperlink>
       <w:r>
-        <w:t xml:space="preserve">, which is stable and can start, continue and resume threads. Phase 2 moves to the </w:t>
+        <w:t xml:space="preserve"> (not labelled stable; it wraps codex exec), which can start, continue and resume threads. Phase 2 moves to the </w:t>
       </w:r>
       <w:hyperlink r:id="rId9" w:history="1">
         <w:r>
@@ -358,7 +358,7 @@
         <w:t xml:space="preserve">You.</w:t>
       </w:r>
       <w:r>
-        <w:t xml:space="preserve"> You type to the Claude liaison in its terminal, and to the Codex liaison through the hub's console. The console also shows both sides of every thread, takes Codex approvals and stops everything. A Codex CLI session or ChatGPT developer mode can also post into the bridge.</w:t>
+        <w:t xml:space="preserve"> You type to the Claude liaison in its terminal, and to the Codex liaison through the hub's console. The console also shows both sides of every thread, takes Codex approvals and stops everything. Your own Codex app or CLI chats can also post into the bridge. ChatGPT joins in Phase 3.</w:t>
       </w:r>
     </w:p>
     <w:p>
@@ -419,7 +419,7 @@
         <w:t xml:space="preserve">--dangerously-load-development-channels</w:t>
       </w:r>
       <w:r>
-        <w:t xml:space="preserve"> flag or an org allowlist. On claude.ai Team or Enterprise, an owner must also enable channels; Pro and Max accounts without an org skip that step. And on the current runtime, the channel server must speak an MCP version older than 2026-07-28 to register. The flag is fine on your own machine but a barrier for other users. If the channel won't load, the Claude liaison can still pull from the bus with </w:t>
+        <w:t xml:space="preserve"> flag or an org allowlist. On claude.ai Team or Enterprise, an owner must also enable channels; Pro and Max accounts without an org skip that step. And on the current runtime, the channel server must speak an MCP version older than 2026-07-28 to register. The flag works only in an interactive session: it asks you to confirm at each start and is ignored with -p, so headless routing workers can't use a channel and pull from the hub instead. Only Team and Enterprise admins can set an org allowlist, so a Pro or Max account can't allowlist its own channel. The flag is fine on your own machine but a barrier for other users. </w:t>
       </w:r>
       <w:r>
         <w:rPr>
@@ -428,7 +428,16 @@
         <w:t xml:space="preserve">check_inbox</w:t>
       </w:r>
       <w:r>
-        <w:t xml:space="preserve">, which is slower. The Agent SDK fallback (decision 3) is the next step after that.</w:t>
+        <w:t xml:space="preserve"> serves outside clients and </w:t>
+      </w:r>
+      <w:r>
+        <w:rPr>
+          <w:rStyle w:val="CodeChar"/>
+        </w:rPr>
+        <w:t xml:space="preserve">-p</w:t>
+      </w:r>
+      <w:r>
+        <w:t xml:space="preserve"> workers, not the liaison: an interactive session doesn't poll on its own. So if the channel won't load, the fallback is the Agent SDK (decision 3).</w:t>
       </w:r>
     </w:p>
     <w:p>
@@ -696,7 +705,7 @@
         <w:t xml:space="preserve">Hard limits are deny rules and plumbing, not requests.</w:t>
       </w:r>
       <w:r>
-        <w:t xml:space="preserve"> The hub starts the Claude liaison with its own settings file and config folder, so your personal settings and standing approvals never load into it. Its deny rules cover </w:t>
+        <w:t xml:space="preserve"> The hub generates the Claude liaison's command line, settings file and config folder, so your personal settings and standing approvals never load into it. You start it in your terminal, or attach to a terminal the hub owns, and confirm the development-channel flag at each start. Its deny rules cover </w:t>
       </w:r>
       <w:r>
         <w:rPr>
@@ -759,7 +768,7 @@
         <w:t xml:space="preserve">.envrc</w:t>
       </w:r>
       <w:r>
-        <w:t xml:space="preserve">. A deny rule is the one level no other setting can override. Cross-session messaging is on by default in every Claude Code session, so until routing (decision 8) is turned on, the liaison's settings also deny SendMessage and ListAgents. Every bridge session also sets crossSessionInbound to refuse, so nothing but the hub's channel can put text in front of it.</w:t>
+        <w:t xml:space="preserve">. A deny rule is the one level no other setting can override. Cross-session messaging is on by default in every Claude Code session, so every bridge session's settings deny SendMessage and ListAgents, permanently; routing goes through the hub instead. Every bridge session also sets crossSessionInbound to refuse, so nothing but the hub's channel can put text in front of it.</w:t>
       </w:r>
     </w:p>
     <w:p>
@@ -849,7 +858,7 @@
         <w:t xml:space="preserve">The hub checks who is calling.</w:t>
       </w:r>
       <w:r>
-        <w:t xml:space="preserve"> There are three principals: the Claude adapter, the Codex adapter and you. Adapter credentials can call only the five bridge tools. Only your credential is accepted on the approve endpoints, so an agent that reaches the hub is refused where it matters.</w:t>
+        <w:t xml:space="preserve"> There are four principals: the Claude adapter, the Codex adapter, codex-user (your own Codex app and CLI chats, which count as agent provenance) and you. The adapter and codex-user credentials can call only the five bridge tools. Only your credential is accepted on the approve endpoints, so an agent that reaches the hub is refused where it matters.</w:t>
       </w:r>
     </w:p>
     <w:p>
@@ -912,7 +921,7 @@
         <w:t xml:space="preserve">get_thread</w:t>
       </w:r>
       <w:r>
-        <w:t xml:space="preserve"> and check_inbox output get the same wrapper and escaping. The channel's instructions say every event comes from the Codex agent, never from you.</w:t>
+        <w:t xml:space="preserve"> and check_inbox output get the same wrapper and escaping. Every event carries a provenance the hub sets. provenance="human" is a note you typed in the console: guidance, never approval, and it can't answer a prompt. Any other provenance is another agent, never you.</w:t>
       </w:r>
     </w:p>
     <w:p>
@@ -1038,7 +1047,7 @@
         <w:t xml:space="preserve">.vscode/**</w:t>
       </w:r>
       <w:r>
-        <w:t xml:space="preserve">, package scripts, Makefile, CI config) and shows you the diff before you fetch. You never accept Claude Code's workspace-trust dialog for an agent clone.</w:t>
+        <w:t xml:space="preserve">, package scripts, Makefile, CI config) and shows you the diff before you fetch. Trust for an agent clone is only ever recorded in the hub-owned config folder, never in your own ~/.claude.json, and only because the clone is sparse (no .claude/, no .mcp.json), so the dialog grants nothing. The interactive liaison does get the dialog for its clone; the launcher pre-sets it in the hub-owned config.</w:t>
       </w:r>
     </w:p>
     <w:p>
@@ -1802,7 +1811,7 @@
               <w:t xml:space="preserve">Recommended</w:t>
             </w:r>
             <w:r>
-              <w:t xml:space="preserve"> (est. 15 to 25 h to a prototype)</w:t>
+              <w:t xml:space="preserve"> (est. 40 to 70 h for Phase 1)</w:t>
             </w:r>
           </w:p>
         </w:tc>
@@ -1859,10 +1868,10 @@
               <w:rPr>
                 <w:b/>
               </w:rPr>
-              <w:t xml:space="preserve">Use now</w:t>
-            </w:r>
-            <w:r>
-              <w:t xml:space="preserve"> after a security review (est. 3 to 6 h); later our Claude-to-Codex shortcut</w:t>
+              <w:t xml:space="preserve">Not used:</w:t>
+            </w:r>
+            <w:r>
+              <w:t xml:space="preserve"> one direction only; later our Claude-to-Codex shortcut</w:t>
             </w:r>
           </w:p>
         </w:tc>
@@ -3244,7 +3253,241 @@
     <w:p>
       <w:pPr/>
       <w:r>
-        <w:t xml:space="preserve">Yes, the Claude liaison can hand work to separate Claude Code sessions, one per project, and the permission model carries over. Claude Code already lets your sessions message each other (</w:t>
+        <w:t xml:space="preserve">Yes. The Claude liaison can hand work to separate Claude Code sessions, one per project, and every leg goes through the hub, so the hub stamps, escapes, counts and logs each one. On the Claude side the project sessions are </w:t>
+      </w:r>
+      <w:r>
+        <w:rPr>
+          <w:rStyle w:val="CodeChar"/>
+        </w:rPr>
+        <w:t xml:space="preserve">claude -p</w:t>
+      </w:r>
+      <w:r>
+        <w:t xml:space="preserve"> workers the hub starts, and they pull their messages with </w:t>
+      </w:r>
+      <w:r>
+        <w:rPr>
+          <w:rStyle w:val="CodeChar"/>
+        </w:rPr>
+        <w:t xml:space="preserve">check_inbox</w:t>
+      </w:r>
+      <w:r>
+        <w:t xml:space="preserve">. They can't be channel sessions, because the development-channel flag works only in an interactive session. Each keeps its own clone, settings and permission prompts. On the Codex side the hub drives one Codex thread per project.</w:t>
+      </w:r>
+    </w:p>
+    <w:p>
+      <w:pPr/>
+      <w:r>
+        <w:rPr>
+          <w:b/>
+        </w:rPr>
+        <w:t xml:space="preserve">How it would work</w:t>
+      </w:r>
+    </w:p>
+    <w:p>
+      <w:pPr>
+        <w:pStyle w:val="ListParagraph"/>
+        <w:numPr>
+          <w:ilvl w:val="0"/>
+          <w:numId w:val="13"/>
+        </w:numPr>
+      </w:pPr>
+      <w:r>
+        <w:t xml:space="preserve">The liaison keeps a project list (name, repo, the session that works on it) and does no project work itself. It sends each request through the hub to the right project session, and the answer comes back the same way.</w:t>
+      </w:r>
+    </w:p>
+    <w:p>
+      <w:pPr>
+        <w:pStyle w:val="ListParagraph"/>
+        <w:numPr>
+          <w:ilvl w:val="0"/>
+          <w:numId w:val="13"/>
+        </w:numPr>
+      </w:pPr>
+      <w:r>
+        <w:t xml:space="preserve">The project sessions are claude -p workers the hub starts, never your own interactive sessions. Each one runs in an agent clone of its repo, with the same hub-owned settings as the liaison, and pulls its messages from the hub with check_inbox.</w:t>
+      </w:r>
+    </w:p>
+    <w:p>
+      <w:pPr>
+        <w:pStyle w:val="ListParagraph"/>
+        <w:numPr>
+          <w:ilvl w:val="0"/>
+          <w:numId w:val="13"/>
+        </w:numPr>
+      </w:pPr>
+      <w:r>
+        <w:t xml:space="preserve">Approving something in one project approves nothing in another.</w:t>
+      </w:r>
+    </w:p>
+    <w:p>
+      <w:pPr>
+        <w:pStyle w:val="ListParagraph"/>
+        <w:numPr>
+          <w:ilvl w:val="0"/>
+          <w:numId w:val="13"/>
+        </w:numPr>
+      </w:pPr>
+      <w:r>
+        <w:t xml:space="preserve">The Codex side mirrors this: one Codex thread per project, each started in that project's clone with pinned settings and driven by the hub.</w:t>
+      </w:r>
+    </w:p>
+    <w:p>
+      <w:pPr>
+        <w:pStyle w:val="ListParagraph"/>
+        <w:numPr>
+          <w:ilvl w:val="0"/>
+          <w:numId w:val="13"/>
+        </w:numPr>
+      </w:pPr>
+      <w:r>
+        <w:rPr>
+          <w:b/>
+        </w:rPr>
+        <w:t xml:space="preserve">Each side routes on its own.</w:t>
+      </w:r>
+      <w:r>
+        <w:t xml:space="preserve"> Projects don't pair up across the bridge. A Claude project session can reach whichever Codex thread the Codex liaison picks, for example an app team on Claude asking devops on Codex. A message records the project it came from, and each liaison picks the destination on its side from a list of projects you have registered.</w:t>
+      </w:r>
+    </w:p>
+    <w:p>
+      <w:pPr>
+        <w:pStyle w:val="ListParagraph"/>
+        <w:numPr>
+          <w:ilvl w:val="0"/>
+          <w:numId w:val="13"/>
+        </w:numPr>
+      </w:pPr>
+      <w:r>
+        <w:rPr>
+          <w:b/>
+        </w:rPr>
+        <w:t xml:space="preserve">The hub checks every destination.</w:t>
+      </w:r>
+      <w:r>
+        <w:t xml:space="preserve"> The receiving liaison picks a destination, but only from the registered list the hub keeps in its own config, and the hub rejects anything else. The hub stamps the source project from the sending session; no agent writes it.</w:t>
+      </w:r>
+    </w:p>
+    <w:p>
+      <w:pPr>
+        <w:pStyle w:val="ListParagraph"/>
+        <w:numPr>
+          <w:ilvl w:val="0"/>
+          <w:numId w:val="13"/>
+        </w:numPr>
+      </w:pPr>
+      <w:r>
+        <w:rPr>
+          <w:b/>
+        </w:rPr>
+        <w:t xml:space="preserve">Routes are an allowlist.</w:t>
+      </w:r>
+      <w:r>
+        <w:t xml:space="preserve"> Hub config lists the permitted source-to-destination pairs, such as app team on Claude to devops on Codex. A message on an unlisted pair is parked, and the console offers to add the route with one click. This stops one compromised thread from reaching every project.</w:t>
+      </w:r>
+    </w:p>
+    <w:p>
+      <w:pPr>
+        <w:pStyle w:val="ListParagraph"/>
+        <w:numPr>
+          <w:ilvl w:val="0"/>
+          <w:numId w:val="13"/>
+        </w:numPr>
+      </w:pPr>
+      <w:r>
+        <w:rPr>
+          <w:b/>
+        </w:rPr>
+        <w:t xml:space="preserve">Caps per project and per route,</w:t>
+      </w:r>
+      <w:r>
+        <w:t xml:space="preserve"> on top of the per-thread and overall caps. A message sent to several projects counts one hop per destination, and the log keeps the source and destination of every leg.</w:t>
+      </w:r>
+    </w:p>
+    <w:p>
+      <w:pPr>
+        <w:pStyle w:val="ListParagraph"/>
+        <w:numPr>
+          <w:ilvl w:val="0"/>
+          <w:numId w:val="13"/>
+        </w:numPr>
+      </w:pPr>
+      <w:r>
+        <w:rPr>
+          <w:b/>
+        </w:rPr>
+        <w:t xml:space="preserve">Devops work raises the stakes.</w:t>
+      </w:r>
+      <w:r>
+        <w:t xml:space="preserve"> In Phase 1, Codex threads run with network off and no credentials. Devops threads can change infrastructure code and propose changes, but they can't deploy or touch live systems. Three more guards apply (from the security re-check):</w:t>
+      </w:r>
+    </w:p>
+    <w:p>
+      <w:pPr>
+        <w:pStyle w:val="ListParagraph"/>
+        <w:numPr>
+          <w:ilvl w:val="1"/>
+          <w:numId w:val="14"/>
+        </w:numPr>
+      </w:pPr>
+      <w:r>
+        <w:rPr>
+          <w:b/>
+        </w:rPr>
+        <w:t xml:space="preserve">CI and infrastructure files are flagged in any repo</w:t>
+      </w:r>
+      <w:r>
+        <w:t xml:space="preserve"> for your review before you push: workflows, CI configs, Dockerfiles, Terraform, Kubernetes, Helm, Ansible and deploy scripts. A GitHub Actions workflow that runs on push gets the repo's secrets on any branch you push. So keep deploy secrets in GitHub environments with required reviewers, or limit deploy workflows to main and pull requests.</w:t>
+      </w:r>
+    </w:p>
+    <w:p>
+      <w:pPr>
+        <w:pStyle w:val="ListParagraph"/>
+        <w:numPr>
+          <w:ilvl w:val="1"/>
+          <w:numId w:val="14"/>
+        </w:numPr>
+      </w:pPr>
+      <w:r>
+        <w:rPr>
+          <w:b/>
+        </w:rPr>
+        <w:t xml:space="preserve">Deploy tools are denied outright,</w:t>
+      </w:r>
+      <w:r>
+        <w:t xml:space="preserve"> even though network is off: terraform apply, kubectl, helm, aws, gcloud, az, ansible-playbook, docker push, ssh and scp. A request to turn network on (for terraform plan, say) triggers the separate live-systems review. Even then it only adds an egress allowlist, never credentials.</w:t>
+      </w:r>
+    </w:p>
+    <w:p>
+      <w:pPr>
+        <w:pStyle w:val="ListParagraph"/>
+        <w:numPr>
+          <w:ilvl w:val="1"/>
+          <w:numId w:val="14"/>
+        </w:numPr>
+      </w:pPr>
+      <w:r>
+        <w:rPr>
+          <w:b/>
+        </w:rPr>
+        <w:t xml:space="preserve">State and credentials stay away from agent clones.</w:t>
+      </w:r>
+      <w:r>
+        <w:t xml:space="preserve"> No tfstate, filled-in tfvars, kubeconfigs, .env files or cloud credential folders in or near them. Codex can read outside its workspace: under workspace-write it can read the whole disk. Its beta permission profiles can deny reads, but they switch off whenever sandbox_mode or --sandbox is set, which the SDK's sandboxMode option does. Build task 11 evaluates the profiles.</w:t>
+      </w:r>
+    </w:p>
+    <w:p>
+      <w:pPr/>
+      <w:r>
+        <w:rPr>
+          <w:b/>
+        </w:rPr>
+        <w:t xml:space="preserve">Why Claude Code's own cross-session messaging stays off</w:t>
+      </w:r>
+    </w:p>
+    <w:p>
+      <w:pPr/>
+      <w:r>
+        <w:t xml:space="preserve">Claude Code also lets your sessions message each other directly (</w:t>
       </w:r>
       <w:hyperlink r:id="rId35" w:history="1">
         <w:r>
@@ -3255,7 +3498,7 @@
         </w:r>
       </w:hyperlink>
       <w:r>
-        <w:t xml:space="preserve">), and each project session keeps its own folder, </w:t>
+        <w:t xml:space="preserve">). Routing doesn't use it. No hub sits in that path, so nothing would stamp, escape, count or log those legs, and its guard against changing </w:t>
       </w:r>
       <w:r>
         <w:rPr>
@@ -3264,7 +3507,79 @@
         <w:t xml:space="preserve">CLAUDE.md</w:t>
       </w:r>
       <w:r>
-        <w:t xml:space="preserve">, settings and permission prompts.</w:t>
+        <w:t xml:space="preserve"> or permissions is an instruction to the model, not enforcement. So every bridge session denies </w:t>
+      </w:r>
+      <w:r>
+        <w:rPr>
+          <w:rStyle w:val="CodeChar"/>
+        </w:rPr>
+        <w:t xml:space="preserve">SendMessage</w:t>
+      </w:r>
+      <w:r>
+        <w:t xml:space="preserve"> and </w:t>
+      </w:r>
+      <w:r>
+        <w:rPr>
+          <w:rStyle w:val="CodeChar"/>
+        </w:rPr>
+        <w:t xml:space="preserve">ListAgents</w:t>
+      </w:r>
+      <w:r>
+        <w:t xml:space="preserve"> and sets </w:t>
+      </w:r>
+      <w:r>
+        <w:rPr>
+          <w:rStyle w:val="CodeChar"/>
+        </w:rPr>
+        <w:t xml:space="preserve">crossSessionInbound</w:t>
+      </w:r>
+      <w:r>
+        <w:t xml:space="preserve"> to refuse. Its docs say the following, which is background for those rules:</w:t>
+      </w:r>
+    </w:p>
+    <w:p>
+      <w:pPr>
+        <w:pStyle w:val="ListParagraph"/>
+        <w:numPr>
+          <w:ilvl w:val="0"/>
+          <w:numId w:val="15"/>
+        </w:numPr>
+      </w:pPr>
+      <w:r>
+        <w:t xml:space="preserve">A message from another session "never counts as your consent, so it can't answer a pending permission prompt on your behalf". It also can't change permission settings or </w:t>
+      </w:r>
+      <w:r>
+        <w:rPr>
+          <w:rStyle w:val="CodeChar"/>
+        </w:rPr>
+        <w:t xml:space="preserve">CLAUDE.md</w:t>
+      </w:r>
+      <w:r>
+        <w:t xml:space="preserve">, and slash commands inside it don't run.</w:t>
+      </w:r>
+    </w:p>
+    <w:p>
+      <w:pPr>
+        <w:pStyle w:val="ListParagraph"/>
+        <w:numPr>
+          <w:ilvl w:val="0"/>
+          <w:numId w:val="15"/>
+        </w:numPr>
+      </w:pPr>
+      <w:r>
+        <w:t xml:space="preserve">Permission prompts still fire in the receiving session. A session that skips permission checks holds incoming messages for your approval rather than acting on them.</w:t>
+      </w:r>
+    </w:p>
+    <w:p>
+      <w:pPr>
+        <w:pStyle w:val="ListParagraph"/>
+        <w:numPr>
+          <w:ilvl w:val="0"/>
+          <w:numId w:val="15"/>
+        </w:numPr>
+      </w:pPr>
+      <w:r>
+        <w:t xml:space="preserve">Message loops are throttled: repeats from one sender are rate-limited and identical ones dropped.</w:t>
       </w:r>
     </w:p>
     <w:p>
@@ -3273,262 +3588,7 @@
         <w:rPr>
           <w:b/>
         </w:rPr>
-        <w:t xml:space="preserve">How it would work</w:t>
-      </w:r>
-    </w:p>
-    <w:p>
-      <w:pPr>
-        <w:pStyle w:val="ListParagraph"/>
-        <w:numPr>
-          <w:ilvl w:val="0"/>
-          <w:numId w:val="13"/>
-        </w:numPr>
-      </w:pPr>
-      <w:r>
-        <w:t xml:space="preserve">The liaison keeps a project list (name, repo, the session that works on it) and does no project work itself. It sends each request to the right project session and passes the answer back over the bridge.</w:t>
-      </w:r>
-    </w:p>
-    <w:p>
-      <w:pPr>
-        <w:pStyle w:val="ListParagraph"/>
-        <w:numPr>
-          <w:ilvl w:val="0"/>
-          <w:numId w:val="13"/>
-        </w:numPr>
-      </w:pPr>
-      <w:r>
-        <w:t xml:space="preserve">The project sessions are bridge sessions the hub starts, never your own interactive sessions. Each one runs in an agent clone of its repo, with the same hub-owned settings as the liaison.</w:t>
-      </w:r>
-    </w:p>
-    <w:p>
-      <w:pPr>
-        <w:pStyle w:val="ListParagraph"/>
-        <w:numPr>
-          <w:ilvl w:val="0"/>
-          <w:numId w:val="13"/>
-        </w:numPr>
-      </w:pPr>
-      <w:r>
-        <w:t xml:space="preserve">Approving something in one project approves nothing in another.</w:t>
-      </w:r>
-    </w:p>
-    <w:p>
-      <w:pPr>
-        <w:pStyle w:val="ListParagraph"/>
-        <w:numPr>
-          <w:ilvl w:val="0"/>
-          <w:numId w:val="13"/>
-        </w:numPr>
-      </w:pPr>
-      <w:r>
-        <w:t xml:space="preserve">The Codex side mirrors this: one Codex thread per project, each started in that project's clone with pinned settings.</w:t>
-      </w:r>
-    </w:p>
-    <w:p>
-      <w:pPr>
-        <w:pStyle w:val="ListParagraph"/>
-        <w:numPr>
-          <w:ilvl w:val="0"/>
-          <w:numId w:val="13"/>
-        </w:numPr>
-      </w:pPr>
-      <w:r>
-        <w:rPr>
-          <w:b/>
-        </w:rPr>
-        <w:t xml:space="preserve">Each side routes on its own.</w:t>
-      </w:r>
-      <w:r>
-        <w:t xml:space="preserve"> Projects don't pair up across the bridge. A Claude project session can reach whichever Codex thread the Codex liaison picks, for example an app team on Claude asking devops on Codex. A message records the project it came from, and each liaison picks the destination on its side from a list of projects you have registered.</w:t>
-      </w:r>
-    </w:p>
-    <w:p>
-      <w:pPr>
-        <w:pStyle w:val="ListParagraph"/>
-        <w:numPr>
-          <w:ilvl w:val="0"/>
-          <w:numId w:val="13"/>
-        </w:numPr>
-      </w:pPr>
-      <w:r>
-        <w:rPr>
-          <w:b/>
-        </w:rPr>
-        <w:t xml:space="preserve">The hub checks every destination.</w:t>
-      </w:r>
-      <w:r>
-        <w:t xml:space="preserve"> The receiving liaison picks a destination, but only from the registered list the hub keeps in its own config, and the hub rejects anything else. The hub stamps the source project from the sending session; no agent writes it.</w:t>
-      </w:r>
-    </w:p>
-    <w:p>
-      <w:pPr>
-        <w:pStyle w:val="ListParagraph"/>
-        <w:numPr>
-          <w:ilvl w:val="0"/>
-          <w:numId w:val="13"/>
-        </w:numPr>
-      </w:pPr>
-      <w:r>
-        <w:rPr>
-          <w:b/>
-        </w:rPr>
-        <w:t xml:space="preserve">Routes are an allowlist.</w:t>
-      </w:r>
-      <w:r>
-        <w:t xml:space="preserve"> Hub config lists the permitted source-to-destination pairs, such as app team on Claude to devops on Codex. A message on an unlisted pair is parked, and the console offers to add the route with one click. This stops one compromised thread from reaching every project.</w:t>
-      </w:r>
-    </w:p>
-    <w:p>
-      <w:pPr>
-        <w:pStyle w:val="ListParagraph"/>
-        <w:numPr>
-          <w:ilvl w:val="0"/>
-          <w:numId w:val="13"/>
-        </w:numPr>
-      </w:pPr>
-      <w:r>
-        <w:rPr>
-          <w:b/>
-        </w:rPr>
-        <w:t xml:space="preserve">Caps per project and per route,</w:t>
-      </w:r>
-      <w:r>
-        <w:t xml:space="preserve"> on top of the per-thread and overall caps. A message sent to several projects counts one hop per destination, and the log keeps the source and destination of every leg.</w:t>
-      </w:r>
-    </w:p>
-    <w:p>
-      <w:pPr>
-        <w:pStyle w:val="ListParagraph"/>
-        <w:numPr>
-          <w:ilvl w:val="0"/>
-          <w:numId w:val="13"/>
-        </w:numPr>
-      </w:pPr>
-      <w:r>
-        <w:rPr>
-          <w:b/>
-        </w:rPr>
-        <w:t xml:space="preserve">Devops work raises the stakes.</w:t>
-      </w:r>
-      <w:r>
-        <w:t xml:space="preserve"> In Phase 1, Codex threads run with network off and no credentials. Devops threads can change infrastructure code and propose changes, but they can't deploy or touch live systems. Three more guards apply (from the security re-check):</w:t>
-      </w:r>
-    </w:p>
-    <w:p>
-      <w:pPr>
-        <w:pStyle w:val="ListParagraph"/>
-        <w:numPr>
-          <w:ilvl w:val="1"/>
-          <w:numId w:val="14"/>
-        </w:numPr>
-      </w:pPr>
-      <w:r>
-        <w:rPr>
-          <w:b/>
-        </w:rPr>
-        <w:t xml:space="preserve">CI and infrastructure files are flagged in any repo</w:t>
-      </w:r>
-      <w:r>
-        <w:t xml:space="preserve"> for your review before you push: workflows, CI configs, Dockerfiles, Terraform, Kubernetes, Helm, Ansible and deploy scripts. A GitHub Actions workflow that runs on push gets the repo's secrets on any branch you push. So keep deploy secrets in GitHub environments with required reviewers, or limit deploy workflows to main and pull requests.</w:t>
-      </w:r>
-    </w:p>
-    <w:p>
-      <w:pPr>
-        <w:pStyle w:val="ListParagraph"/>
-        <w:numPr>
-          <w:ilvl w:val="1"/>
-          <w:numId w:val="14"/>
-        </w:numPr>
-      </w:pPr>
-      <w:r>
-        <w:rPr>
-          <w:b/>
-        </w:rPr>
-        <w:t xml:space="preserve">Deploy tools are denied outright,</w:t>
-      </w:r>
-      <w:r>
-        <w:t xml:space="preserve"> even though network is off: terraform apply, kubectl, helm, aws, gcloud, az, ansible-playbook, docker push, ssh and scp. A request to turn network on (for terraform plan, say) triggers the separate live-systems review. Even then it only adds an egress allowlist, never credentials.</w:t>
-      </w:r>
-    </w:p>
-    <w:p>
-      <w:pPr>
-        <w:pStyle w:val="ListParagraph"/>
-        <w:numPr>
-          <w:ilvl w:val="1"/>
-          <w:numId w:val="14"/>
-        </w:numPr>
-      </w:pPr>
-      <w:r>
-        <w:rPr>
-          <w:b/>
-        </w:rPr>
-        <w:t xml:space="preserve">State and credentials stay away from agent clones.</w:t>
-      </w:r>
-      <w:r>
-        <w:t xml:space="preserve"> No tfstate, filled-in tfvars, kubeconfigs, .env files or cloud credential folders in or near them. Whether Codex can read outside its workspace still needs verifying.</w:t>
-      </w:r>
-    </w:p>
-    <w:p>
-      <w:pPr/>
-      <w:r>
-        <w:rPr>
-          <w:b/>
-        </w:rPr>
-        <w:t xml:space="preserve">What Claude Code guarantees here, per its docs</w:t>
-      </w:r>
-    </w:p>
-    <w:p>
-      <w:pPr>
-        <w:pStyle w:val="ListParagraph"/>
-        <w:numPr>
-          <w:ilvl w:val="0"/>
-          <w:numId w:val="15"/>
-        </w:numPr>
-      </w:pPr>
-      <w:r>
-        <w:t xml:space="preserve">A message from another session "never counts as your consent, so it can't answer a pending permission prompt on your behalf". It also can't change permission settings or </w:t>
-      </w:r>
-      <w:r>
-        <w:rPr>
-          <w:rStyle w:val="CodeChar"/>
-        </w:rPr>
-        <w:t xml:space="preserve">CLAUDE.md</w:t>
-      </w:r>
-      <w:r>
-        <w:t xml:space="preserve">, and slash commands inside it don't run.</w:t>
-      </w:r>
-    </w:p>
-    <w:p>
-      <w:pPr>
-        <w:pStyle w:val="ListParagraph"/>
-        <w:numPr>
-          <w:ilvl w:val="0"/>
-          <w:numId w:val="15"/>
-        </w:numPr>
-      </w:pPr>
-      <w:r>
-        <w:t xml:space="preserve">Permission prompts still fire in the receiving session. A session that skips permission checks holds incoming messages for your approval rather than acting on them.</w:t>
-      </w:r>
-    </w:p>
-    <w:p>
-      <w:pPr>
-        <w:pStyle w:val="ListParagraph"/>
-        <w:numPr>
-          <w:ilvl w:val="0"/>
-          <w:numId w:val="15"/>
-        </w:numPr>
-      </w:pPr>
-      <w:r>
-        <w:t xml:space="preserve">Message loops are throttled: repeats from one sender are rate-limited and identical ones dropped.</w:t>
-      </w:r>
-    </w:p>
-    <w:p>
-      <w:pPr/>
-      <w:r>
-        <w:rPr>
-          <w:b/>
-        </w:rPr>
-        <w:t xml:space="preserve">Limits</w:t>
+        <w:t xml:space="preserve">Where cross-session messages can reach</w:t>
       </w:r>
     </w:p>
     <w:tbl>
@@ -3555,7 +3615,7 @@
           <w:p>
             <w:pPr/>
             <w:r>
-              <w:t xml:space="preserve">Where the project session runs</w:t>
+              <w:t xml:space="preserve">Where the other session runs</w:t>
             </w:r>
           </w:p>
         </w:tc>
@@ -3614,7 +3674,16 @@
           <w:p>
             <w:pPr/>
             <w:r>
-              <w:t xml:space="preserve">Used, under the rules below</w:t>
+              <w:t xml:space="preserve">Denied in every bridge session; your own sessions set </w:t>
+            </w:r>
+            <w:r>
+              <w:rPr>
+                <w:rStyle w:val="CodeChar"/>
+              </w:rPr>
+              <w:t xml:space="preserve">crossSessionInbound</w:t>
+            </w:r>
+            <w:r>
+              <w:t xml:space="preserve"> to hold or refuse</w:t>
             </w:r>
           </w:p>
         </w:tc>
@@ -3649,7 +3718,7 @@
           <w:p>
             <w:pPr/>
             <w:r>
-              <w:t xml:space="preserve">Not in v1. </w:t>
+              <w:t xml:space="preserve">Not used. </w:t>
             </w:r>
             <w:r>
               <w:rPr>
@@ -3743,16 +3812,13 @@
           <w:p>
             <w:pPr/>
             <w:r>
-              <w:t xml:space="preserve">Only as </w:t>
+              <w:t xml:space="preserve">Never set; workers pull from the hub with </w:t>
             </w:r>
             <w:r>
               <w:rPr>
                 <w:rStyle w:val="CodeChar"/>
               </w:rPr>
-              <w:t xml:space="preserve">claude -p --bare</w:t>
-            </w:r>
-            <w:r>
-              <w:t xml:space="preserve"> (see below)</w:t>
+              <w:t xml:space="preserve">check_inbox</w:t>
             </w:r>
           </w:p>
         </w:tc>
@@ -3974,7 +4040,7 @@
         <w:t xml:space="preserve">Gate for routing</w:t>
       </w:r>
       <w:r>
-        <w:t xml:space="preserve">, separate from Phase 1: Codex asks the liaison to "tell the payments session to push". The liaison must refuse by deny rule, and the project session must prompt or deny if the request arrives anyway. Routing turns "one sandboxed clone" into "every repo on the machine", so it gets its own gate. Recommended: put a </w:t>
+        <w:t xml:space="preserve">, separate from Phase 1: Codex asks the liaison to "tell the payments session to push". The liaison is expected to decline, but that is only an instruction. Whether or not it forwards the request, the project session's push deny blocks it and the attempt is logged, so the test passes on the project session's control alone. Routing turns "one sandboxed clone" into "every repo on the machine", so it gets its own gate. Recommended: put a </w:t>
       </w:r>
       <w:r>
         <w:rPr>
@@ -4495,7 +4561,7 @@
         <w:t xml:space="preserve">Loop, rate and cost guards.</w:t>
       </w:r>
       <w:r>
-        <w:t xml:space="preserve"> Default limits: 8 hops and 20 turns per thread, a daily spend cap per side, and global caps on messages per hour, new threads per day and concurrent threads. Hitting any of them parks the thread and asks you.</w:t>
+        <w:t xml:space="preserve"> Default limits: 8 hops and 20 turns per thread, a daily spend cap per side, and global caps on messages per hour, new threads per day and concurrent threads. Hitting any of them parks the thread and asks you. The spend cap is estimated USD that the hub computes from token counts, not billed dollars: OpenTelemetry metrics on the Claude side, which the hub-owned settings turn on, and the Codex SDK's per-turn usage. Neither vendor caps or bills an interactive subscription session, and Claude Code's own --max-budget-usd works only in print mode.</w:t>
       </w:r>
     </w:p>
     <w:p>
@@ -5306,7 +5372,16 @@
     <w:p>
       <w:pPr/>
       <w:r>
-        <w:t xml:space="preserve">The green light you'd give now covers Phase 0, and Phases 1 and 2 if Phase 0 shows you want two-way conversation. Phases 3 to 5 are separate calls, made once v1 has proven itself.</w:t>
+        <w:t xml:space="preserve">The green light you'd give now covers Phases 1 and 2. There is no trial phase: you want two-way conversation from the start, and </w:t>
+      </w:r>
+      <w:r>
+        <w:rPr>
+          <w:rStyle w:val="CodeChar"/>
+        </w:rPr>
+        <w:t xml:space="preserve">codex-plugin-cc</w:t>
+      </w:r>
+      <w:r>
+        <w:t xml:space="preserve"> only goes one way. Phases 3 to 5 are separate calls, made once v1 has proven itself.</w:t>
       </w:r>
     </w:p>
     <w:p>
@@ -5314,13 +5389,13 @@
       <w:r>
         <w:drawing>
           <wp:inline distT="0" distB="0" distL="0" distR="0">
-            <wp:extent cx="5486400" cy="5510892"/>
-            <wp:docPr id="4" name="image4" descr="roadmap · 6 phases, 5 gates"/>
+            <wp:extent cx="5486400" cy="4645478"/>
+            <wp:docPr id="4" name="image4" descr="roadmap · 5 phases, 4 gates"/>
             <a:graphic xmlns:a="http://schemas.openxmlformats.org/drawingml/2006/main">
               <a:graphicData uri="http://schemas.openxmlformats.org/drawingml/2006/picture">
                 <pic:pic xmlns:pic="http://schemas.openxmlformats.org/drawingml/2006/picture">
                   <pic:nvPicPr>
-                    <pic:cNvPr id="4" name="image4" descr="roadmap · 6 phases, 5 gates"/>
+                    <pic:cNvPr id="4" name="image4" descr="roadmap · 5 phases, 4 gates"/>
                     <pic:cNvPicPr/>
                   </pic:nvPicPr>
                   <pic:blipFill>
@@ -5332,7 +5407,7 @@
                   <pic:spPr>
                     <a:xfrm>
                       <a:off x="0" y="0"/>
-                      <a:ext cx="5486400" cy="5510892"/>
+                      <a:ext cx="5486400" cy="4645478"/>
                     </a:xfrm>
                     <a:prstGeom prst="rect">
                       <a:avLst/>
@@ -5348,7 +5423,7 @@
     <w:p>
       <w:pPr/>
       <w:r>
-        <w:t xml:space="preserve">roadmap · 6 phases, 5 gates</w:t>
+        <w:t xml:space="preserve">roadmap · 5 phases, 4 gates</w:t>
       </w:r>
     </w:p>
     <w:p>
@@ -5405,7 +5480,7 @@
           <w:p>
             <w:pPr/>
             <w:r>
-              <w:t xml:space="preserve">Phase 0: review and set up codex-plugin-cc</w:t>
+              <w:t xml:space="preserve">Phase 1 (build tasks 1 to 12), including the security review's must-fix items</w:t>
             </w:r>
           </w:p>
         </w:tc>
@@ -5416,7 +5491,7 @@
           <w:p>
             <w:pPr/>
             <w:r>
-              <w:t xml:space="preserve">5 to 9 h</w:t>
+              <w:t xml:space="preserve">40 to 70 h (pre-build review)</w:t>
             </w:r>
           </w:p>
         </w:tc>
@@ -5429,7 +5504,7 @@
           <w:p>
             <w:pPr/>
             <w:r>
-              <w:t xml:space="preserve">Phases 1 and 2 to a working prototype</w:t>
+              <w:t xml:space="preserve">Routing milestone (build tasks 13 to 15)</w:t>
             </w:r>
           </w:p>
         </w:tc>
@@ -5440,7 +5515,7 @@
           <w:p>
             <w:pPr/>
             <w:r>
-              <w:t xml:space="preserve">15 to 25 h, plus 5 to 10 h for the trust controls and 4 to 8 h for the security review's must-fix items</w:t>
+              <w:t xml:space="preserve">15 to 25 h (pre-build review)</w:t>
             </w:r>
           </w:p>
         </w:tc>
@@ -5453,7 +5528,7 @@
           <w:p>
             <w:pPr/>
             <w:r>
-              <w:t xml:space="preserve">Prototype to daily-driver quality</w:t>
+              <w:t xml:space="preserve">Phase 2 (App Server, Codex approvals in the console)</w:t>
             </w:r>
           </w:p>
         </w:tc>
@@ -5464,7 +5539,7 @@
           <w:p>
             <w:pPr/>
             <w:r>
-              <w:t xml:space="preserve">another 20 to 40 h</w:t>
+              <w:t xml:space="preserve">10 to 20 h (pre-build review)</w:t>
             </w:r>
           </w:p>
         </w:tc>
@@ -5477,7 +5552,7 @@
           <w:p>
             <w:pPr/>
             <w:r>
-              <w:t xml:space="preserve">Upkeep once running</w:t>
+              <w:t xml:space="preserve">Prototype to daily-driver quality</w:t>
             </w:r>
           </w:p>
         </w:tc>
@@ -5488,7 +5563,7 @@
           <w:p>
             <w:pPr/>
             <w:r>
-              <w:t xml:space="preserve">2 to 4 h a month, more when a preview API changes</w:t>
+              <w:t xml:space="preserve">another 20 to 40 h</w:t>
             </w:r>
           </w:p>
         </w:tc>
@@ -5501,6 +5576,30 @@
           <w:p>
             <w:pPr/>
             <w:r>
+              <w:t xml:space="preserve">Upkeep once running</w:t>
+            </w:r>
+          </w:p>
+        </w:tc>
+        <w:tc>
+          <w:tcPr>
+            <w:tcW w:w="4680" w:type="dxa"/>
+          </w:tcPr>
+          <w:p>
+            <w:pPr/>
+            <w:r>
+              <w:t xml:space="preserve">2 to 4 h a month, more when a preview API changes</w:t>
+            </w:r>
+          </w:p>
+        </w:tc>
+      </w:tr>
+      <w:tr>
+        <w:tc>
+          <w:tcPr>
+            <w:tcW w:w="4680" w:type="dxa"/>
+          </w:tcPr>
+          <w:p>
+            <w:pPr/>
+            <w:r>
               <w:t xml:space="preserve">Phase 5 open-source release</w:t>
             </w:r>
           </w:p>
@@ -5701,7 +5800,7 @@
     <w:p>
       <w:pPr/>
       <w:r>
-        <w:t xml:space="preserve">Estimates are the build-vs-adopt thread's, for one experienced developer working with Claude Code or Codex. They are ranges for comparison, not commitments.</w:t>
+        <w:t xml:space="preserve">Estimates for Phase 1, routing and Phase 2 are the pre-build review's; the rest are the build-vs-adopt thread's. All are for one experienced developer working with Claude Code or Codex. They are ranges for comparison, not commitments.</w:t>
       </w:r>
     </w:p>
     <w:p>
@@ -5906,7 +6005,10 @@
           <w:p>
             <w:pPr/>
             <w:r>
-              <w:t xml:space="preserve">Agreed</w:t>
+              <w:t xml:space="preserve">Changed</w:t>
+            </w:r>
+            <w:r>
+              <w:t xml:space="preserve"> Superseded 2026-10-10: no trial; the build starts with Phase 1</w:t>
             </w:r>
           </w:p>
         </w:tc>
@@ -6066,7 +6168,7 @@
           <w:p>
             <w:pPr/>
             <w:r>
-              <w:t xml:space="preserve">8 hops, 20 turns and a daily cap you set; edits allowed only inside each side's own clone</w:t>
+              <w:t xml:space="preserve">8 hops, 20 turns and a daily cap you set; edits allowed only inside each side's own clone. The cap is estimated USD the hub computes from token counts, not billed dollars</w:t>
             </w:r>
           </w:p>
         </w:tc>
@@ -6180,7 +6282,7 @@
           <w:p>
             <w:pPr/>
             <w:r>
-              <w:t xml:space="preserve">TypeScript, narrowly: one language with the web console. Python is close, because OpenAI's stable Python SDK drives the App Server directly</w:t>
+              <w:t xml:space="preserve">TypeScript, narrowly: one language with the web console. Python is close, because OpenAI's stable Python SDK drives the App Server directly. The TypeScript Codex SDK isn't labelled stable; it wraps codex exec</w:t>
             </w:r>
           </w:p>
         </w:tc>
@@ -6349,7 +6451,7 @@
     <w:p>
       <w:pPr/>
       <w:r>
-        <w:t xml:space="preserve">Research done 2026-10-09 by this thread and three sibling threads: a prior-art survey, a build-vs-adopt analysis and an independent security review (`security-review.md`). Their full notes are in the project files under </w:t>
+        <w:t xml:space="preserve">Research done 2026-10-09 by this thread and three sibling threads: a prior-art survey, a build-vs-adopt analysis and an independent security review (`security-review.md`). A pre-build review then checked these docs against the vendors' current docs; it sits next to the security review as pre-build-review.md. Their full notes are in the project files under </w:t>
       </w:r>
       <w:r>
         <w:rPr>

</xml_diff>